<commit_message>
Update paper cn l12 documents
</commit_message>
<xml_diff>
--- a/paper_cn_l12/paper_cn_l12.docx
+++ b/paper_cn_l12/paper_cn_l12.docx
@@ -14716,7 +14716,7 @@
           <w:b w:val="0"/>
           <w:sz w:val="16"/>
         </w:rPr>
-        <w:t>[1] 刘涛, 田捷, 王杰, 等. 信息物理融合系统的综合安全威胁与防御研究[J]. 自动化学报, 2019, 45(1): 5-24.</w:t>
+        <w:t xml:space="preserve">[1] 刘烃, 田决, 王稼舟, 等. 信息物理融合系统综合安全威胁与防御研究[J]. 自动化学报, 2019, 45(1): 5-24.</w:t>
       </w:r>
     </w:p>
     <w:p>
@@ -14729,7 +14729,7 @@
           <w:b w:val="0"/>
           <w:sz w:val="16"/>
         </w:rPr>
-        <w:t>LIU Tao, TIAN Jie, WANG Jie, et al. Integrated security threats and defense of cyber-physical systems[J]. Acta Automatica Sinica, 2019, 45(1): 5-24.</w:t>
+        <w:t xml:space="preserve">LIU Ting, TIAN Jue, WANG Jiazhou, et al. Integrated security threats and defense of cyber-physical systems[J]. Acta Automatica Sinica, 2019, 45(1): 5-24.</w:t>
       </w:r>
     </w:p>
     <w:p>
@@ -14742,7 +14742,7 @@
           <w:b w:val="0"/>
           <w:sz w:val="16"/>
         </w:rPr>
-        <w:t>[2] 马珍, 张弘, 朱兰, 等. 美国电力市场信息披露制度及其对中国的启示[J]. 电力系统自动化, 2017, 41(24): 49-57.</w:t>
+        <w:t xml:space="preserve">[2] 马子明, 钟海旺, 李竹, 等. 美国电力市场信息披露体系及其对中国的启示[J]. 电力系统自动化, 2017, 41(24): 49-57.</w:t>
       </w:r>
     </w:p>
     <w:p>
@@ -14755,7 +14755,7 @@
           <w:b w:val="0"/>
           <w:sz w:val="16"/>
         </w:rPr>
-        <w:t>MA Zhen, ZHANG Hong, ZHU Lan, et al. Information disclosure system in American electricity market and its enlightenment for China[J]. Automation of Electric Power Systems, 2017, 41(24): 49-57.</w:t>
+        <w:t xml:space="preserve">MA Ziming, ZHONG Haiwang, LI Zhu, et al. Information disclosure system in American electricity market and its enlightenment for China[J]. Automation of Electric Power Systems, 2017, 41(24): 49-57.</w:t>
       </w:r>
     </w:p>
     <w:p>
@@ -14768,7 +14768,7 @@
           <w:b w:val="0"/>
           <w:sz w:val="16"/>
         </w:rPr>
-        <w:t>[3] Fan Z, Horger T, Bastian J, et al. An overview of PJM energy market design and development[C]//2008 Third International Conference on Electric Utility Deregulation and Restructuring and Power Technologies. Piscataway: IEEE, 2008: 12-17.</w:t>
+        <w:t xml:space="preserve">[3] Fan Z, Horger T, Bastian J, et al. An overview of PJM energy market design and development[C]//2008 Third International Conference on Electric Utility Deregulation and Restructuring and Power Technologies. Piscataway: IEEE, 2008: 12-17.</w:t>
       </w:r>
     </w:p>
     <w:p>
@@ -14781,7 +14781,7 @@
           <w:b w:val="0"/>
           <w:sz w:val="16"/>
         </w:rPr>
-        <w:t>[4] 朱涛, 陈颖, 张宁, 等. 面向电力数据共享的安全机制研究[J]. 中国电机工程学报, 2020, 40(S1): 21-30.</w:t>
+        <w:t xml:space="preserve">[4] 邢汇笛, 龚钢军, 翟明岳, 等. 电力数据共享安全防护与隐私保护综述[J]. 综合智慧能源, 2024, 46(5): 30-40.</w:t>
       </w:r>
     </w:p>
     <w:p>
@@ -14794,7 +14794,7 @@
           <w:b w:val="0"/>
           <w:sz w:val="16"/>
         </w:rPr>
-        <w:t>ZHU Tao, CHEN Ying, ZHANG Ning, et al. Security mechanisms for power data sharing[J]. Proceedings of the CSEE, 2020, 40(S1): 21-30.</w:t>
+        <w:t xml:space="preserve">XING Huidi, GONG Gangjun, ZHAI Mingyue, et al. Research on security and privacy protection of electric power data sharing[J]. Integrated Intelligent Energy, 2024, 46(5): 30-40.</w:t>
       </w:r>
     </w:p>
     <w:p>
@@ -14807,7 +14807,7 @@
           <w:b w:val="0"/>
           <w:sz w:val="16"/>
         </w:rPr>
-        <w:t>[5] 刘烃, 王子骏, 刘杨, 等. 数据推断: 信息物理融合系统数据泄露威胁范式和防御方法[J]. 中国科学: 信息科学, 2023.</w:t>
+        <w:t xml:space="preserve">[5] 刘烃, 王子骏, 刘杨, 等. 数据推断: 信息物理融合系统数据泄露威胁范式和防御方法[J]. 中国科学: 信息科学, 2023, 53(11): 2152-2179.</w:t>
       </w:r>
     </w:p>
     <w:p>
@@ -14820,7 +14820,7 @@
           <w:b w:val="0"/>
           <w:sz w:val="16"/>
         </w:rPr>
-        <w:t>[6] Sankar L, Rajagopalan S R, Mohajer S, et al. Smart meter privacy: A theoretical framework[J]. IEEE Transactions on Smart Grid, 2013, 4(2): 837-846.</w:t>
+        <w:t xml:space="preserve">LIU Ting, WANG Zijun, LIU Yang, et al. Data inference: data leakage paradigms and defense methods in cyber-physical systems[J]. Scientia Sinica Informationis, 2023, 53(11): 2152-2179.</w:t>
       </w:r>
     </w:p>
     <w:p>
@@ -14833,7 +14833,7 @@
           <w:b w:val="0"/>
           <w:sz w:val="16"/>
         </w:rPr>
-        <w:t>[7] Giaconi G, Gündüz D, Poor H V. Privacy-aware smart metering: Progress and challenges[J]. IEEE Signal Processing Magazine, 2018, 35(6): 59-78.</w:t>
+        <w:t xml:space="preserve">[6] Sankar L, Rajagopalan S R, Mohajer S, et al. Smart meter privacy: A theoretical framework[J]. IEEE Transactions on Smart Grid, 2013, 4(2): 837-846.</w:t>
       </w:r>
     </w:p>
     <w:p>
@@ -14846,7 +14846,7 @@
           <w:b w:val="0"/>
           <w:sz w:val="16"/>
         </w:rPr>
-        <w:t>[8] Adewole K S, Torra V. Privacy issues in smart grid data: From energy disaggregation to disclosure risk[C]//International Conference on Database and Expert Systems Applications. Cham: Springer, 2022: 71-84.</w:t>
+        <w:t xml:space="preserve">[7] Giaconi G, Gündüz D, Poor H V. Privacy-aware smart metering: Progress and challenges[J]. IEEE Signal Processing Magazine, 2018, 35(6): 59-78.</w:t>
       </w:r>
     </w:p>
     <w:p>
@@ -14859,7 +14859,7 @@
           <w:b w:val="0"/>
           <w:sz w:val="16"/>
         </w:rPr>
-        <w:t>[9] 张伯明, 孙宏斌, 吴文传, 等. 智能电网控制中心的信息安全问题[J]. 南方电网技术, 2012, 6(2): 1-7.</w:t>
+        <w:t xml:space="preserve">[8] Adewole K S, Torra V. Privacy issues in smart grid data: From energy disaggregation to disclosure risk[C]//International Conference on Database and Expert Systems Applications. Cham: Springer, 2022: 71-84.</w:t>
       </w:r>
     </w:p>
     <w:p>
@@ -14872,7 +14872,7 @@
           <w:b w:val="0"/>
           <w:sz w:val="16"/>
         </w:rPr>
-        <w:t>ZHANG Boming, SUN Hongbin, WU Wenchuan, et al. Information security issues in smart grid control centers[J]. Southern Power System Technology, 2012, 6(2): 1-7.</w:t>
+        <w:t xml:space="preserve">[9] 刘家男, 翁健. 智能电网安全研究综述[J]. 信息网络安全, 2016, 16(5): 78-84.</w:t>
       </w:r>
     </w:p>
     <w:p>
@@ -14885,7 +14885,7 @@
           <w:b w:val="0"/>
           <w:sz w:val="16"/>
         </w:rPr>
-        <w:t>[10] 陈颖, 王科, 朱涛, 等. 电力大数据隐私保护技术综述[J]. 电力系统自动化, 2021, 45(14): 157-168.</w:t>
+        <w:t xml:space="preserve">LIU Jianan, WENG Jian. Survey on smart grid security[J]. Netinfo Security, 2016, 16(5): 78-84.</w:t>
       </w:r>
     </w:p>
     <w:p>
@@ -14898,7 +14898,7 @@
           <w:b w:val="0"/>
           <w:sz w:val="16"/>
         </w:rPr>
-        <w:t>CHEN Ying, WANG Ke, ZHU Tao, et al. Review on privacy-preserving technologies for power big data[J]. Automation of Electric Power Systems, 2021, 45(14): 157-168.</w:t>
+        <w:t xml:space="preserve">[10] 邓晓平, 张桂青, 魏庆来, 等. 非侵入式负荷监测综述[J]. 自动化学报, 2022, 48(3): 644-663.</w:t>
       </w:r>
     </w:p>
     <w:p>
@@ -14911,7 +14911,7 @@
           <w:b w:val="0"/>
           <w:sz w:val="16"/>
         </w:rPr>
-        <w:t>[11] 兰丁, 朱慧, 吴杰, 等. 基于改进 AlexNet-GRU 深度学习网络的配电网短期负荷预测方法[C]//2021 IEEE 5th Conference on Energy Internet and Energy System Integration. Piscataway: IEEE, 2021: 3004-3010.</w:t>
+        <w:t xml:space="preserve">DENG Xiaoping, ZHANG Guiqing, WEI Qinglai, et al. A survey on the non-intrusive load monitoring[J]. Acta Automatica Sinica, 2022, 48(3): 644-663.</w:t>
       </w:r>
     </w:p>
     <w:p>
@@ -14924,7 +14924,7 @@
           <w:b w:val="0"/>
           <w:sz w:val="16"/>
         </w:rPr>
-        <w:t>LAN Ding, ZHU Hui, WU Jie, et al. A short-term load forecasting method of distribution network based on improved AlexNet-GRU deep learning network[C]//2021 IEEE 5th Conference on Energy Internet and Energy System Integration. Piscataway: IEEE, 2021: 3004-3010.</w:t>
+        <w:t xml:space="preserve">[11] 严雪颖, 秦川, 鞠平, 等. 负荷功率模型的最优特征选择研究[J]. 电力工程技术, 2021, 40(3): 84-91.</w:t>
       </w:r>
     </w:p>
     <w:p>
@@ -14937,7 +14937,7 @@
           <w:b w:val="0"/>
           <w:sz w:val="16"/>
         </w:rPr>
-        <w:t>[12] 焦鑫, 孙源, 彭迪, 等. 基于方差变点与相关性分析的光伏功率异常数据清洗[C]//2021 6th International Conference on Power and Renewable Energy. Piscataway: IEEE, 2021: 1140-1145.</w:t>
+        <w:t xml:space="preserve">YAN Xueying, QIN Chuan, JU Ping, et al. Optimal feature selection of load power models[J]. Electric Power Engineering Technology, 2021, 40(3): 84-91.</w:t>
       </w:r>
     </w:p>
     <w:p>
@@ -14950,7 +14950,7 @@
           <w:b w:val="0"/>
           <w:sz w:val="16"/>
         </w:rPr>
-        <w:t>JIAO Xin, SUN Yuan, PENG Di, et al. Photovoltaic power abnormal data cleaning based on variance change point and correlation analysis[C]//2021 6th International Conference on Power and Renewable Energy. Piscataway: IEEE, 2021: 1140-1145.</w:t>
+        <w:t xml:space="preserve">[12] Jiao X Y, Sun Y Z, Peng D, et al. Photovoltaic power abnormal data cleaning based on variance change point and correlation analysis[C]//2021 6th International Conference on Power and Renewable Energy (ICPRE). Piscataway: IEEE, 2021: 1140-1145.</w:t>
       </w:r>
     </w:p>
     <w:p>
@@ -14963,7 +14963,7 @@
           <w:b w:val="0"/>
           <w:sz w:val="16"/>
         </w:rPr>
-        <w:t>[13] 邓鑫, 张超, 彭辉, 等. 基于相关性分析与特征提取的区域电网短期负荷预测[C]//2022 7th Asia Conference on Power and Electrical Engineering. Piscataway: IEEE, 2022: 1081-1085.</w:t>
+        <w:t xml:space="preserve">[13] Deng X Y, Zhang C K, Peng H, et al. Short-term load forecasting for regional power grids based on correlation analysis and feature extraction[C]//2022 7th Asia Conference on Power and Electrical Engineering (ACPEE). Piscataway: IEEE, 2022: 1081-1085.</w:t>
       </w:r>
     </w:p>
     <w:p>
@@ -14976,7 +14976,7 @@
           <w:b w:val="0"/>
           <w:sz w:val="16"/>
         </w:rPr>
-        <w:t>DENG Xin, ZHANG Chao, PENG Hui, et al. Short-term load forecasting for regional power grids based on correlation analysis and feature extraction[C]//2022 7th Asia Conference on Power and Electrical Engineering. Piscataway: IEEE, 2022: 1081-1085.</w:t>
+        <w:t xml:space="preserve">[14] Székely G J, Rizzo M L, Bakirov N K. Measuring and testing dependence by correlation of distances[J]. The Annals of Statistics, 2007, 35(6): 2769-2794.</w:t>
       </w:r>
     </w:p>
     <w:p>
@@ -14989,7 +14989,7 @@
           <w:b w:val="0"/>
           <w:sz w:val="16"/>
         </w:rPr>
-        <w:t>[14] Székely G J, Rizzo M L, Bakirov N K. Measuring and testing dependence by correlation of distances[J]. The Annals of Statistics, 2007, 35(6): 2769-2794.</w:t>
+        <w:t xml:space="preserve">[15] Reshef D N, Reshef Y A, Finucane H K, et al. Detecting novel associations in large data sets[J]. Science, 2011, 334(6062): 1518-1524.</w:t>
       </w:r>
     </w:p>
     <w:p>
@@ -15002,7 +15002,7 @@
           <w:b w:val="0"/>
           <w:sz w:val="16"/>
         </w:rPr>
-        <w:t>[15] Reshef D N, Reshef Y A, Finucane H K, et al. Detecting novel associations in large data sets[J]. Science, 2011, 334(6062): 1518-1524.</w:t>
+        <w:t xml:space="preserve">[16] Xing Z Y, Wang Z J, Feng J L, et al. MIC-DNN: data-driven correlation analysis framework for power data[C]//2025 40th Youth Academic Annual Conference of Chinese Association of Automation (YAC). Piscataway: IEEE, 2025: 2969-2974.</w:t>
       </w:r>
     </w:p>
     <w:p>
@@ -15015,7 +15015,7 @@
           <w:b w:val="0"/>
           <w:sz w:val="16"/>
         </w:rPr>
-        <w:t>[16] 邢治, 王征, 冯健, 等. MIC-DNN：电力数据关联分析框架[C]//2025 40th Youth Academic Annual Conference of Chinese Association of Automation. Piscataway: IEEE, 2025: 2969-2974.</w:t>
+        <w:t xml:space="preserve">[17] LeCun Y, Bengio Y, Hinton G. Deep learning[J]. Nature, 2015, 521(7553): 436-444.</w:t>
       </w:r>
     </w:p>
     <w:p>
@@ -15028,7 +15028,7 @@
           <w:b w:val="0"/>
           <w:sz w:val="16"/>
         </w:rPr>
-        <w:t>XING Zhi, WANG Zheng, FENG Jian, et al. MIC-DNN: Data-driven correlation analysis framework for power data[C]//2025 40th Youth Academic Annual Conference of Chinese Association of Automation. Piscataway: IEEE, 2025: 2969-2974.</w:t>
+        <w:t xml:space="preserve">[18] Goodfellow I, Bengio Y, Courville A. Deep learning[M]. Cambridge: MIT Press, 2016.</w:t>
       </w:r>
     </w:p>
     <w:p>
@@ -15041,7 +15041,7 @@
           <w:b w:val="0"/>
           <w:sz w:val="16"/>
         </w:rPr>
-        <w:t>[17] LeCun Y, Bengio Y, Hinton G. Deep learning[J]. Nature, 2015, 521(7553): 436-444.</w:t>
+        <w:t xml:space="preserve">[19] Breiman L. Random forests[J]. Machine Learning, 2001, 45(1): 5-32.</w:t>
       </w:r>
     </w:p>
     <w:p>
@@ -15054,7 +15054,7 @@
           <w:b w:val="0"/>
           <w:sz w:val="16"/>
         </w:rPr>
-        <w:t>[18] Goodfellow I, Bengio Y, Courville A. Deep learning[M]. Cambridge: MIT Press, 2016.</w:t>
+        <w:t xml:space="preserve">[20] Chen T, Guestrin C. XGBoost: A scalable tree boosting system[C]//Proceedings of the 22nd ACM SIGKDD International Conference on Knowledge Discovery and Data Mining. New York: ACM, 2016: 785-794.</w:t>
       </w:r>
     </w:p>
     <w:p>
@@ -15067,7 +15067,7 @@
           <w:b w:val="0"/>
           <w:sz w:val="16"/>
         </w:rPr>
-        <w:t>[19] Breiman L. Random forests[J]. Machine Learning, 2001, 45(1): 5-32.</w:t>
+        <w:t xml:space="preserve">[21] Wang Y, Chen Q, Hong T, et al. Review of smart meter data analytics: Applications, methodologies, and challenges[J]. IEEE Transactions on Smart Grid, 2019, 10(3): 3125-3148.</w:t>
       </w:r>
     </w:p>
     <w:p>
@@ -15080,7 +15080,7 @@
           <w:b w:val="0"/>
           <w:sz w:val="16"/>
         </w:rPr>
-        <w:t>[20] Chen T, Guestrin C. XGBoost: A scalable tree boosting system[C]//Proceedings of the 22nd ACM SIGKDD International Conference on Knowledge Discovery and Data Mining. New York: ACM, 2016: 785-794.</w:t>
+        <w:t xml:space="preserve">[22] Tibshirani R. Regression shrinkage and selection via the lasso[J]. Journal of the Royal Statistical Society: Series B, 1996, 58(1): 267-288.</w:t>
       </w:r>
     </w:p>
     <w:p>
@@ -15093,7 +15093,7 @@
           <w:b w:val="0"/>
           <w:sz w:val="16"/>
         </w:rPr>
-        <w:t>[21] Wang Y, Chen Q, Hong T, et al. Review of smart meter data analytics: Applications, methodologies, and challenges[J]. IEEE Transactions on Smart Grid, 2019, 10(3): 3125-3148.</w:t>
+        <w:t xml:space="preserve">[23] Zou H, Hastie T. Regularization and variable selection via the elastic net[J]. Journal of the Royal Statistical Society: Series B, 2005, 67(2): 301-320.</w:t>
       </w:r>
     </w:p>
     <w:p>
@@ -15106,7 +15106,7 @@
           <w:b w:val="0"/>
           <w:sz w:val="16"/>
         </w:rPr>
-        <w:t>[22] Tibshirani R. Regression shrinkage and selection via the lasso[J]. Journal of the Royal Statistical Society: Series B, 1996, 58(1): 267-288.</w:t>
+        <w:t xml:space="preserve">[24] Pearson K. Notes on regression and inheritance in the case of two parents[J]. Proceedings of the Royal Society of London, 1895, 58: 240-242.</w:t>
       </w:r>
     </w:p>
     <w:p>
@@ -15119,7 +15119,7 @@
           <w:b w:val="0"/>
           <w:sz w:val="16"/>
         </w:rPr>
-        <w:t>[23] Zou H, Hastie T. Regularization and variable selection via the elastic net[J]. Journal of the Royal Statistical Society: Series B, 2005, 67(2): 301-320.</w:t>
+        <w:t xml:space="preserve">[25] Spearman C. The proof and measurement of association between two things[J]. The American Journal of Psychology, 1904, 15(1): 72-101.</w:t>
       </w:r>
     </w:p>
     <w:p>
@@ -15132,7 +15132,7 @@
           <w:b w:val="0"/>
           <w:sz w:val="16"/>
         </w:rPr>
-        <w:t>[24] Pearson K. Notes on regression and inheritance in the case of two parents[J]. Proceedings of the Royal Society of London, 1895, 58: 240-242.</w:t>
+        <w:t xml:space="preserve">[26] Kendall M G. A new measure of rank correlation[J]. Biometrika, 1938, 30(1/2): 81-93.</w:t>
       </w:r>
     </w:p>
     <w:p>
@@ -15145,7 +15145,7 @@
           <w:b w:val="0"/>
           <w:sz w:val="16"/>
         </w:rPr>
-        <w:t>[25] Spearman C. The proof and measurement of association between two things[J]. The American Journal of Psychology, 1904, 15(1): 72-101.</w:t>
+        <w:t xml:space="preserve">[27] Cover T M, Thomas J A. Elements of information theory[M]. 2nd ed. Hoboken: John Wiley &amp; Sons, 2006.</w:t>
       </w:r>
     </w:p>
     <w:p>
@@ -15158,7 +15158,7 @@
           <w:b w:val="0"/>
           <w:sz w:val="16"/>
         </w:rPr>
-        <w:t>[26] Kendall M G. A new measure of rank correlation[J]. Biometrika, 1938, 30(1/2): 81-93.</w:t>
+        <w:t xml:space="preserve">[28] Gretton A, Bousquet O, Smola A, et al. Measuring statistical dependence with Hilbert-Schmidt norms[C]//Algorithmic Learning Theory. Berlin: Springer, 2005: 63-77.</w:t>
       </w:r>
     </w:p>
     <w:p>
@@ -15171,33 +15171,7 @@
           <w:b w:val="0"/>
           <w:sz w:val="16"/>
         </w:rPr>
-        <w:t>[27] Cover T M, Thomas J A. Elements of information theory[M]. 2nd ed. Hoboken: John Wiley &amp; Sons, 2006.</w:t>
-      </w:r>
-    </w:p>
-    <w:p>
-      <w:pPr>
-        <w:spacing w:line="240" w:lineRule="auto" w:before="0" w:after="0"/>
-      </w:pPr>
-      <w:r>
-        <w:rPr>
-          <w:rFonts w:ascii="Times New Roman" w:hAnsi="Times New Roman" w:eastAsia="方正书宋_GBK"/>
-          <w:b w:val="0"/>
-          <w:sz w:val="16"/>
-        </w:rPr>
-        <w:t>[28] Gretton A, Bousquet O, Smola A, et al. Measuring statistical dependence with Hilbert-Schmidt norms[C]//Algorithmic Learning Theory. Berlin: Springer, 2005: 63-77.</w:t>
-      </w:r>
-    </w:p>
-    <w:p>
-      <w:pPr>
-        <w:spacing w:line="240" w:lineRule="auto" w:before="0" w:after="0"/>
-      </w:pPr>
-      <w:r>
-        <w:rPr>
-          <w:rFonts w:ascii="Times New Roman" w:hAnsi="Times New Roman" w:eastAsia="方正书宋_GBK"/>
-          <w:b w:val="0"/>
-          <w:sz w:val="16"/>
-        </w:rPr>
-        <w:t>[29] PJM Interconnection. PJM Data Miner 2[EB/OL]. [2025-05-01]. https://dataminer2.pjm.com.</w:t>
+        <w:t xml:space="preserve">[29] PJM Interconnection. PJM Data Miner 2[EB/OL]. [2025-05-01]. https://dataminer2.pjm.com.</w:t>
       </w:r>
     </w:p>
     <w:p>

</xml_diff>